<commit_message>
updating tables and updating analyses
</commit_message>
<xml_diff>
--- a/output/Tables-Figures.docx
+++ b/output/Tables-Figures.docx
@@ -10,9 +10,10 @@
         <w:t xml:space="preserve">Tables and Figures</w:t>
       </w:r>
     </w:p>
+    <w:bookmarkStart w:id="9" w:name="table-1.-baseline-characteristics-by-sex"/>
     <w:p>
       <w:pPr>
-        <w:pStyle w:val="FirstParagraph"/>
+        <w:pStyle w:val="Heading1"/>
       </w:pPr>
       <w:r>
         <w:rPr>
@@ -3123,9 +3124,11 @@
         <w:br w:type="page"/>
       </w:r>
     </w:p>
+    <w:bookmarkEnd w:id="9"/>
+    <w:bookmarkStart w:id="10" w:name="Xad41cd767627ba0ede46e82198c3e431b6c6b2b"/>
     <w:p>
       <w:pPr>
-        <w:pStyle w:val="BodyText"/>
+        <w:pStyle w:val="Heading1"/>
       </w:pPr>
       <w:r>
         <w:rPr>
@@ -4447,7 +4450,7 @@
                 <w:rFonts w:ascii="Calibri" w:hAnsi="Calibri"/>
                 <w:sz w:val="20"/>
               </w:rPr>
-              <w:t xml:space="default">AI, Adequate Intake (550 mg/day for men, 425 mg/day for women); BMI, body mass index; CI, confidence interval.</w:t>
+              <w:t xml:space="default">AI, Adequate intake (550 mg/day for men, 425 mg/day for women); BMI, body mass index; CI, confidence interval.</w:t>
             </w:r>
           </w:p>
         </w:tc>
@@ -4458,9 +4461,11 @@
         <w:br w:type="page"/>
       </w:r>
     </w:p>
+    <w:bookmarkEnd w:id="10"/>
+    <w:bookmarkStart w:id="11" w:name="X6fefab3000ad671ee03712a30350951819a3de8"/>
     <w:p>
       <w:pPr>
-        <w:pStyle w:val="BodyText"/>
+        <w:pStyle w:val="Heading1"/>
       </w:pPr>
       <w:r>
         <w:rPr>
@@ -5459,7 +5464,7 @@
                 <w:rFonts w:ascii="Calibri" w:hAnsi="Calibri"/>
                 <w:sz w:val="20"/>
               </w:rPr>
-              <w:t xml:space="default">AI, Adequate Intake (425 mg/day for women); BMI, body mass index; CI, confidence interval.</w:t>
+              <w:t xml:space="default">AI, Adequate intake (425 mg/day for women); BMI, body mass index; CI, confidence interval.</w:t>
             </w:r>
           </w:p>
         </w:tc>
@@ -5470,9 +5475,11 @@
         <w:br w:type="page"/>
       </w:r>
     </w:p>
+    <w:bookmarkEnd w:id="11"/>
+    <w:bookmarkStart w:id="12" w:name="X42f13c0e5bd9924dbed3642fbaa176300f6d8e3"/>
     <w:p>
       <w:pPr>
-        <w:pStyle w:val="BodyText"/>
+        <w:pStyle w:val="Heading1"/>
       </w:pPr>
       <w:r>
         <w:rPr>
@@ -7351,7 +7358,7 @@
                 <w:rFonts w:ascii="Calibri" w:hAnsi="Calibri"/>
                 <w:sz w:val="20"/>
               </w:rPr>
-              <w:t xml:space="default">Abbreviations: ALT, alanine aminotransferase; AST, aspartate aminotransferase; BMI, body mass index; CI, confidence interval; GGT, gamma-glutamyl transferase.</w:t>
+              <w:t xml:space="default">ALT, alanine aminotransferase; AST, aspartate aminotransferase; BMI, body mass index; CI, confidence interval; GGT, gamma-glutamyl transferase.</w:t>
             </w:r>
           </w:p>
         </w:tc>
@@ -7362,9 +7369,11 @@
         <w:br w:type="page"/>
       </w:r>
     </w:p>
+    <w:bookmarkEnd w:id="12"/>
+    <w:bookmarkStart w:id="13" w:name="X8d80ade8623b01d6c5d875e6c357efa962082e7"/>
     <w:p>
       <w:pPr>
-        <w:pStyle w:val="BodyText"/>
+        <w:pStyle w:val="Heading1"/>
       </w:pPr>
       <w:r>
         <w:rPr>
@@ -8126,9 +8135,11 @@
         <w:br w:type="page"/>
       </w:r>
     </w:p>
+    <w:bookmarkEnd w:id="13"/>
+    <w:bookmarkStart w:id="14" w:name="X555e921a337b4e50998f394d8da69aa78932a34"/>
     <w:p>
       <w:pPr>
-        <w:pStyle w:val="BodyText"/>
+        <w:pStyle w:val="Heading1"/>
       </w:pPr>
       <w:r>
         <w:rPr>
@@ -10419,9 +10430,11 @@
         <w:br w:type="page"/>
       </w:r>
     </w:p>
+    <w:bookmarkEnd w:id="14"/>
+    <w:bookmarkStart w:id="15" w:name="Xdd9b33f4215d0b5a83d36af281989042b4d0f57"/>
     <w:p>
       <w:pPr>
-        <w:pStyle w:val="BodyText"/>
+        <w:pStyle w:val="Heading1"/>
       </w:pPr>
       <w:r>
         <w:rPr>
@@ -10863,7 +10876,7 @@
                 <w:rFonts w:ascii="Calibri" w:hAnsi="Calibri"/>
                 <w:sz w:val="20"/>
               </w:rPr>
-              <w:t xml:space="default">0.86, 1.06</w:t>
+              <w:t xml:space="default">0.83, 1.10</w:t>
             </w:r>
           </w:p>
         </w:tc>
@@ -10935,7 +10948,7 @@
                 <w:rFonts w:ascii="Calibri" w:hAnsi="Calibri"/>
                 <w:sz w:val="20"/>
               </w:rPr>
-              <w:t xml:space="default">0.91, 1.01</w:t>
+              <w:t xml:space="default">0.90, 1.03</w:t>
             </w:r>
           </w:p>
         </w:tc>
@@ -11007,7 +11020,7 @@
                 <w:rFonts w:ascii="Calibri" w:hAnsi="Calibri"/>
                 <w:sz w:val="20"/>
               </w:rPr>
-              <w:t xml:space="default">0.80, 1.10</w:t>
+              <w:t xml:space="default">0.76, 1.16</w:t>
             </w:r>
           </w:p>
         </w:tc>
@@ -11108,7 +11121,7 @@
                 <w:rFonts w:ascii="Calibri" w:hAnsi="Calibri"/>
                 <w:sz w:val="20"/>
               </w:rPr>
-              <w:t xml:space="default">0.91, 1.13</w:t>
+              <w:t xml:space="default">0.87, 1.17</w:t>
             </w:r>
           </w:p>
         </w:tc>
@@ -11180,7 +11193,7 @@
                 <w:rFonts w:ascii="Calibri" w:hAnsi="Calibri"/>
                 <w:sz w:val="20"/>
               </w:rPr>
-              <w:t xml:space="default">0.93, 1.04</w:t>
+              <w:t xml:space="default">0.92, 1.06</w:t>
             </w:r>
           </w:p>
         </w:tc>
@@ -11252,7 +11265,7 @@
                 <w:rFonts w:ascii="Calibri" w:hAnsi="Calibri"/>
                 <w:sz w:val="20"/>
               </w:rPr>
-              <w:t xml:space="default">0.78, 1.16</w:t>
+              <w:t xml:space="default">0.74, 1.23</w:t>
             </w:r>
           </w:p>
         </w:tc>
@@ -11353,7 +11366,7 @@
                 <w:rFonts w:ascii="Calibri" w:hAnsi="Calibri"/>
                 <w:sz w:val="20"/>
               </w:rPr>
-              <w:t xml:space="default">0.83, 0.94</w:t>
+              <w:t xml:space="default">0.81, 0.96</w:t>
             </w:r>
           </w:p>
         </w:tc>
@@ -11425,7 +11438,7 @@
                 <w:rFonts w:ascii="Calibri" w:hAnsi="Calibri"/>
                 <w:sz w:val="20"/>
               </w:rPr>
-              <w:t xml:space="default">0.89, 0.99</w:t>
+              <w:t xml:space="default">0.87, 1.01</w:t>
             </w:r>
           </w:p>
         </w:tc>
@@ -11497,7 +11510,7 @@
                 <w:rFonts w:ascii="Calibri" w:hAnsi="Calibri"/>
                 <w:sz w:val="20"/>
               </w:rPr>
-              <w:t xml:space="default">0.85, 1.05</w:t>
+              <w:t xml:space="default">0.83, 1.09</w:t>
             </w:r>
           </w:p>
         </w:tc>
@@ -11610,27 +11623,41 @@
         <w:br w:type="page"/>
       </w:r>
     </w:p>
+    <w:bookmarkEnd w:id="15"/>
+    <w:bookmarkStart w:id="19" w:name="figure-1"/>
     <w:p>
       <w:pPr>
-        <w:pStyle w:val="BodyText"/>
+        <w:pStyle w:val="Heading1"/>
+      </w:pPr>
+      <w:r>
+        <w:rPr>
+          <w:b/>
+          <w:bCs/>
+        </w:rPr>
+        <w:t xml:space="preserve">Figure 1</w:t>
+      </w:r>
+    </w:p>
+    <w:p>
+      <w:pPr>
+        <w:pStyle w:val="FirstParagraph"/>
       </w:pPr>
       <w:r>
         <w:drawing>
           <wp:inline>
             <wp:extent cx="5334000" cy="3000374"/>
             <wp:effectExtent b="0" l="0" r="0" t="0"/>
-            <wp:docPr descr="" title="" id="10" name="Picture"/>
+            <wp:docPr descr="" title="" id="17" name="Picture"/>
             <a:graphic>
               <a:graphicData uri="http://schemas.openxmlformats.org/drawingml/2006/picture">
                 <pic:pic>
                   <pic:nvPicPr>
-                    <pic:cNvPr descr="figure1_sex_bmi.png" id="11" name="Picture"/>
+                    <pic:cNvPr descr="figure1_sex_bmi.png" id="18" name="Picture"/>
                     <pic:cNvPicPr>
                       <a:picLocks noChangeArrowheads="1" noChangeAspect="1"/>
                     </pic:cNvPicPr>
                   </pic:nvPicPr>
                   <pic:blipFill>
-                    <a:blip r:embed="rId9"/>
+                    <a:blip r:embed="rId16"/>
                     <a:stretch>
                       <a:fillRect/>
                     </a:stretch>
@@ -11662,27 +11689,41 @@
         <w:br w:type="page"/>
       </w:r>
     </w:p>
+    <w:bookmarkEnd w:id="19"/>
+    <w:bookmarkStart w:id="23" w:name="figure-2"/>
     <w:p>
       <w:pPr>
-        <w:pStyle w:val="BodyText"/>
+        <w:pStyle w:val="Heading1"/>
+      </w:pPr>
+      <w:r>
+        <w:rPr>
+          <w:b/>
+          <w:bCs/>
+        </w:rPr>
+        <w:t xml:space="preserve">Figure 2</w:t>
+      </w:r>
+    </w:p>
+    <w:p>
+      <w:pPr>
+        <w:pStyle w:val="FirstParagraph"/>
       </w:pPr>
       <w:r>
         <w:drawing>
           <wp:inline>
             <wp:extent cx="5334000" cy="3000374"/>
             <wp:effectExtent b="0" l="0" r="0" t="0"/>
-            <wp:docPr descr="" title="" id="13" name="Picture"/>
+            <wp:docPr descr="" title="" id="21" name="Picture"/>
             <a:graphic>
               <a:graphicData uri="http://schemas.openxmlformats.org/drawingml/2006/picture">
                 <pic:pic>
                   <pic:nvPicPr>
-                    <pic:cNvPr descr="figure2_menopause.png" id="14" name="Picture"/>
+                    <pic:cNvPr descr="figure2_menopause.png" id="22" name="Picture"/>
                     <pic:cNvPicPr>
                       <a:picLocks noChangeArrowheads="1" noChangeAspect="1"/>
                     </pic:cNvPicPr>
                   </pic:nvPicPr>
                   <pic:blipFill>
-                    <a:blip r:embed="rId12"/>
+                    <a:blip r:embed="rId20"/>
                     <a:stretch>
                       <a:fillRect/>
                     </a:stretch>
@@ -11714,27 +11755,41 @@
         <w:br w:type="page"/>
       </w:r>
     </w:p>
+    <w:bookmarkEnd w:id="23"/>
+    <w:bookmarkStart w:id="27" w:name="figure-3"/>
     <w:p>
       <w:pPr>
-        <w:pStyle w:val="BodyText"/>
+        <w:pStyle w:val="Heading1"/>
+      </w:pPr>
+      <w:r>
+        <w:rPr>
+          <w:b/>
+          <w:bCs/>
+        </w:rPr>
+        <w:t xml:space="preserve">Figure 3</w:t>
+      </w:r>
+    </w:p>
+    <w:p>
+      <w:pPr>
+        <w:pStyle w:val="FirstParagraph"/>
       </w:pPr>
       <w:r>
         <w:drawing>
           <wp:inline>
             <wp:extent cx="5334000" cy="3000374"/>
             <wp:effectExtent b="0" l="0" r="0" t="0"/>
-            <wp:docPr descr="" title="" id="16" name="Picture"/>
+            <wp:docPr descr="" title="" id="25" name="Picture"/>
             <a:graphic>
               <a:graphicData uri="http://schemas.openxmlformats.org/drawingml/2006/picture">
                 <pic:pic>
                   <pic:nvPicPr>
-                    <pic:cNvPr descr="figure3_groups.png" id="17" name="Picture"/>
+                    <pic:cNvPr descr="figure3_groups.png" id="26" name="Picture"/>
                     <pic:cNvPicPr>
                       <a:picLocks noChangeArrowheads="1" noChangeAspect="1"/>
                     </pic:cNvPicPr>
                   </pic:nvPicPr>
                   <pic:blipFill>
-                    <a:blip r:embed="rId15"/>
+                    <a:blip r:embed="rId24"/>
                     <a:stretch>
                       <a:fillRect/>
                     </a:stretch>
@@ -11761,6 +11816,7 @@
         </w:drawing>
       </w:r>
     </w:p>
+    <w:bookmarkEnd w:id="27"/>
     <w:sectPr>
       <w:footnotePr>
         <w:numRestart w:val="eachSect"/>

</xml_diff>

<commit_message>
refining formatting errors with flowchart
</commit_message>
<xml_diff>
--- a/output/Tables-Figures.docx
+++ b/output/Tables-Figures.docx
@@ -11624,7 +11624,7 @@
       </w:r>
     </w:p>
     <w:bookmarkEnd w:id="15"/>
-    <w:bookmarkStart w:id="19" w:name="figure-1"/>
+    <w:bookmarkStart w:id="20" w:name="figure-1.-participant-flowchart"/>
     <w:p>
       <w:pPr>
         <w:pStyle w:val="Heading1"/>
@@ -11634,7 +11634,1179 @@
           <w:b/>
           <w:bCs/>
         </w:rPr>
-        <w:t xml:space="preserve">Figure 1</w:t>
+        <w:t xml:space="preserve">Figure 1. Participant flowchart</w:t>
+      </w:r>
+    </w:p>
+    <w:p>
+      <w:pPr>
+        <w:pStyle w:val="SourceCode"/>
+      </w:pPr>
+      <w:r>
+        <w:rPr>
+          <w:rStyle w:val="FunctionTok"/>
+        </w:rPr>
+        <w:t xml:space="preserve">readRDS</w:t>
+      </w:r>
+      <w:r>
+        <w:rPr>
+          <w:rStyle w:val="NormalTok"/>
+        </w:rPr>
+        <w:t xml:space="preserve">(</w:t>
+      </w:r>
+      <w:r>
+        <w:rPr>
+          <w:rStyle w:val="FunctionTok"/>
+        </w:rPr>
+        <w:t xml:space="preserve">here</w:t>
+      </w:r>
+      <w:r>
+        <w:rPr>
+          <w:rStyle w:val="NormalTok"/>
+        </w:rPr>
+        <w:t xml:space="preserve">(</w:t>
+      </w:r>
+      <w:r>
+        <w:rPr>
+          <w:rStyle w:val="StringTok"/>
+        </w:rPr>
+        <w:t xml:space="preserve">"output/table_exclusion_funnel.rds"</w:t>
+      </w:r>
+      <w:r>
+        <w:rPr>
+          <w:rStyle w:val="NormalTok"/>
+        </w:rPr>
+        <w:t xml:space="preserve">))</w:t>
+      </w:r>
+    </w:p>
+    <w:tbl xmlns:w="http://schemas.openxmlformats.org/wordprocessingml/2006/main" xmlns:wp="http://schemas.openxmlformats.org/drawingml/2006/wordprocessingDrawing" xmlns:r="http://schemas.openxmlformats.org/officeDocument/2006/relationships" xmlns:w14="http://schemas.microsoft.com/office/word/2010/wordml">
+      <w:tblPr>
+        <w:tblCellMar>
+          <w:top w:w="0" w:type="dxa"/>
+          <w:bottom w:w="0" w:type="dxa"/>
+          <w:start w:w="60" w:type="dxa"/>
+          <w:end w:w="60" w:type="dxa"/>
+        </w:tblCellMar>
+        <w:tblW w:type="auto" w:w="0"/>
+        <w:tblLook w:firstRow="0" w:lastRow="0" w:firstColumn="0" w:lastColumn="0" w:noHBand="0" w:noVBand="0"/>
+        <w:jc w:val="center"/>
+      </w:tblPr>
+      <w:tr>
+        <w:trPr>
+          <w:cantSplit/>
+          <w:tblHeader/>
+        </w:trPr>
+        <w:tc>
+          <w:tcPr>
+            <w:tcBorders>
+              <w:top w:val="single" w:sz="16" w:space="0" w:color="D3D3D3"/>
+              <w:bottom w:val="single" w:sz="16" w:space="0" w:color="D3D3D3"/>
+              <w:start w:val="single" w:space="0" w:color="D3D3D3"/>
+            </w:tcBorders>
+          </w:tcPr>
+          <w:p>
+            <w:pPr>
+              <w:spacing w:before="0" w:after="60"/>
+              <w:keepNext/>
+              <w:jc w:val="start"/>
+            </w:pPr>
+            <w:r>
+              <w:rPr>
+                <w:rFonts w:ascii="Calibri" w:hAnsi="Calibri"/>
+                <w:sz w:val="20"/>
+              </w:rPr>
+              <w:t xml:space="default">Eligibility criterion</w:t>
+            </w:r>
+          </w:p>
+        </w:tc>
+        <w:tc>
+          <w:tcPr>
+            <w:tcBorders>
+              <w:top w:val="single" w:sz="16" w:space="0" w:color="D3D3D3"/>
+              <w:bottom w:val="single" w:sz="16" w:space="0" w:color="D3D3D3"/>
+            </w:tcBorders>
+          </w:tcPr>
+          <w:p>
+            <w:pPr>
+              <w:spacing w:before="0" w:after="60"/>
+              <w:keepNext/>
+              <w:jc w:val="end"/>
+            </w:pPr>
+            <w:r>
+              <w:rPr>
+                <w:rFonts w:ascii="Calibri" w:hAnsi="Calibri"/>
+                <w:sz w:val="20"/>
+              </w:rPr>
+              <w:t xml:space="default">Remaining, n</w:t>
+            </w:r>
+          </w:p>
+        </w:tc>
+        <w:tc>
+          <w:tcPr>
+            <w:tcBorders>
+              <w:top w:val="single" w:sz="16" w:space="0" w:color="D3D3D3"/>
+              <w:bottom w:val="single" w:sz="16" w:space="0" w:color="D3D3D3"/>
+              <w:end w:val="single" w:space="0" w:color="D3D3D3"/>
+            </w:tcBorders>
+          </w:tcPr>
+          <w:p>
+            <w:pPr>
+              <w:spacing w:before="0" w:after="60"/>
+              <w:keepNext/>
+              <w:jc w:val="end"/>
+            </w:pPr>
+            <w:r>
+              <w:rPr>
+                <w:rFonts w:ascii="Calibri" w:hAnsi="Calibri"/>
+                <w:sz w:val="20"/>
+              </w:rPr>
+              <w:t xml:space="default">Excluded, n</w:t>
+            </w:r>
+          </w:p>
+        </w:tc>
+      </w:tr>
+      <w:tr>
+        <w:trPr>
+          <w:cantSplit/>
+        </w:trPr>
+        <w:tc>
+          <w:tcPr>
+            <w:tcBorders>
+              <w:top w:val="single" w:space="0" w:color="D3D3D3"/>
+              <w:bottom w:val="single" w:space="0" w:color="D3D3D3"/>
+              <w:start w:val="single" w:space="0" w:color="D3D3D3"/>
+              <w:end w:val="single" w:space="0" w:color="D3D3D3"/>
+            </w:tcBorders>
+          </w:tcPr>
+          <w:p>
+            <w:pPr>
+              <w:spacing w:before="0" w:after="60"/>
+              <w:keepNext/>
+              <w:jc w:val="start"/>
+            </w:pPr>
+            <w:r>
+              <w:rPr>
+                <w:rFonts w:ascii="Calibri" w:hAnsi="Calibri"/>
+                <w:sz w:val="20"/>
+              </w:rPr>
+              <w:t xml:space="default">Adults aged 20 years and older</w:t>
+            </w:r>
+          </w:p>
+        </w:tc>
+        <w:tc>
+          <w:tcPr>
+            <w:tcBorders>
+              <w:top w:val="single" w:space="0" w:color="D3D3D3"/>
+              <w:bottom w:val="single" w:space="0" w:color="D3D3D3"/>
+              <w:start w:val="single" w:space="0" w:color="D3D3D3"/>
+              <w:end w:val="single" w:space="0" w:color="D3D3D3"/>
+            </w:tcBorders>
+          </w:tcPr>
+          <w:p>
+            <w:pPr>
+              <w:spacing w:before="0" w:after="60"/>
+              <w:keepNext/>
+              <w:jc w:val="end"/>
+            </w:pPr>
+            <w:r>
+              <w:rPr>
+                <w:rFonts w:ascii="Calibri" w:hAnsi="Calibri"/>
+                <w:sz w:val="20"/>
+              </w:rPr>
+              <w:t xml:space="default">7,809</w:t>
+            </w:r>
+          </w:p>
+        </w:tc>
+        <w:tc>
+          <w:tcPr>
+            <w:tcBorders>
+              <w:top w:val="single" w:space="0" w:color="D3D3D3"/>
+              <w:bottom w:val="single" w:space="0" w:color="D3D3D3"/>
+              <w:start w:val="single" w:space="0" w:color="D3D3D3"/>
+              <w:end w:val="single" w:space="0" w:color="D3D3D3"/>
+            </w:tcBorders>
+          </w:tcPr>
+          <w:p>
+            <w:pPr>
+              <w:spacing w:before="0" w:after="60"/>
+              <w:keepNext/>
+              <w:jc w:val="end"/>
+            </w:pPr>
+            <w:r>
+              <w:rPr>
+                <w:rFonts w:ascii="Calibri" w:hAnsi="Calibri"/>
+                <w:sz w:val="20"/>
+              </w:rPr>
+              <w:t xml:space="default"/>
+            </w:r>
+          </w:p>
+        </w:tc>
+      </w:tr>
+      <w:tr>
+        <w:trPr>
+          <w:cantSplit/>
+        </w:trPr>
+        <w:tc>
+          <w:tcPr>
+            <w:tcBorders>
+              <w:top w:val="single" w:space="0" w:color="D3D3D3"/>
+              <w:bottom w:val="single" w:space="0" w:color="D3D3D3"/>
+              <w:start w:val="single" w:space="0" w:color="D3D3D3"/>
+              <w:end w:val="single" w:space="0" w:color="D3D3D3"/>
+            </w:tcBorders>
+          </w:tcPr>
+          <w:p>
+            <w:pPr>
+              <w:spacing w:before="0" w:after="60"/>
+              <w:keepNext/>
+              <w:jc w:val="start"/>
+            </w:pPr>
+            <w:r>
+              <w:rPr>
+                <w:rFonts w:ascii="Calibri" w:hAnsi="Calibri"/>
+                <w:sz w:val="20"/>
+              </w:rPr>
+              <w:t xml:space="default">Two reliable dietary recalls</w:t>
+            </w:r>
+          </w:p>
+        </w:tc>
+        <w:tc>
+          <w:tcPr>
+            <w:tcBorders>
+              <w:top w:val="single" w:space="0" w:color="D3D3D3"/>
+              <w:bottom w:val="single" w:space="0" w:color="D3D3D3"/>
+              <w:start w:val="single" w:space="0" w:color="D3D3D3"/>
+              <w:end w:val="single" w:space="0" w:color="D3D3D3"/>
+            </w:tcBorders>
+          </w:tcPr>
+          <w:p>
+            <w:pPr>
+              <w:spacing w:before="0" w:after="60"/>
+              <w:keepNext/>
+              <w:jc w:val="end"/>
+            </w:pPr>
+            <w:r>
+              <w:rPr>
+                <w:rFonts w:ascii="Calibri" w:hAnsi="Calibri"/>
+                <w:sz w:val="20"/>
+              </w:rPr>
+              <w:t xml:space="default">4,285</w:t>
+            </w:r>
+          </w:p>
+        </w:tc>
+        <w:tc>
+          <w:tcPr>
+            <w:tcBorders>
+              <w:top w:val="single" w:space="0" w:color="D3D3D3"/>
+              <w:bottom w:val="single" w:space="0" w:color="D3D3D3"/>
+              <w:start w:val="single" w:space="0" w:color="D3D3D3"/>
+              <w:end w:val="single" w:space="0" w:color="D3D3D3"/>
+            </w:tcBorders>
+          </w:tcPr>
+          <w:p>
+            <w:pPr>
+              <w:spacing w:before="0" w:after="60"/>
+              <w:keepNext/>
+              <w:jc w:val="end"/>
+            </w:pPr>
+            <w:r>
+              <w:rPr>
+                <w:rFonts w:ascii="Calibri" w:hAnsi="Calibri"/>
+                <w:sz w:val="20"/>
+              </w:rPr>
+              <w:t xml:space="default">3,524</w:t>
+            </w:r>
+          </w:p>
+        </w:tc>
+      </w:tr>
+      <w:tr>
+        <w:trPr>
+          <w:cantSplit/>
+        </w:trPr>
+        <w:tc>
+          <w:tcPr>
+            <w:tcBorders>
+              <w:top w:val="single" w:space="0" w:color="D3D3D3"/>
+              <w:bottom w:val="single" w:space="0" w:color="D3D3D3"/>
+              <w:start w:val="single" w:space="0" w:color="D3D3D3"/>
+              <w:end w:val="single" w:space="0" w:color="D3D3D3"/>
+            </w:tcBorders>
+          </w:tcPr>
+          <w:p>
+            <w:pPr>
+              <w:spacing w:before="0" w:after="60"/>
+              <w:keepNext/>
+              <w:jc w:val="start"/>
+            </w:pPr>
+            <w:r>
+              <w:rPr>
+                <w:rFonts w:ascii="Calibri" w:hAnsi="Calibri"/>
+                <w:sz w:val="20"/>
+              </w:rPr>
+              <w:t xml:space="default">Valid 2-day dietary sample weight</w:t>
+            </w:r>
+          </w:p>
+        </w:tc>
+        <w:tc>
+          <w:tcPr>
+            <w:tcBorders>
+              <w:top w:val="single" w:space="0" w:color="D3D3D3"/>
+              <w:bottom w:val="single" w:space="0" w:color="D3D3D3"/>
+              <w:start w:val="single" w:space="0" w:color="D3D3D3"/>
+              <w:end w:val="single" w:space="0" w:color="D3D3D3"/>
+            </w:tcBorders>
+          </w:tcPr>
+          <w:p>
+            <w:pPr>
+              <w:spacing w:before="0" w:after="60"/>
+              <w:keepNext/>
+              <w:jc w:val="end"/>
+            </w:pPr>
+            <w:r>
+              <w:rPr>
+                <w:rFonts w:ascii="Calibri" w:hAnsi="Calibri"/>
+                <w:sz w:val="20"/>
+              </w:rPr>
+              <w:t xml:space="default">4,285</w:t>
+            </w:r>
+          </w:p>
+        </w:tc>
+        <w:tc>
+          <w:tcPr>
+            <w:tcBorders>
+              <w:top w:val="single" w:space="0" w:color="D3D3D3"/>
+              <w:bottom w:val="single" w:space="0" w:color="D3D3D3"/>
+              <w:start w:val="single" w:space="0" w:color="D3D3D3"/>
+              <w:end w:val="single" w:space="0" w:color="D3D3D3"/>
+            </w:tcBorders>
+          </w:tcPr>
+          <w:p>
+            <w:pPr>
+              <w:spacing w:before="0" w:after="60"/>
+              <w:keepNext/>
+              <w:jc w:val="end"/>
+            </w:pPr>
+            <w:r>
+              <w:rPr>
+                <w:rFonts w:ascii="Calibri" w:hAnsi="Calibri"/>
+                <w:sz w:val="20"/>
+              </w:rPr>
+              <w:t xml:space="default">0</w:t>
+            </w:r>
+          </w:p>
+        </w:tc>
+      </w:tr>
+      <w:tr>
+        <w:trPr>
+          <w:cantSplit/>
+        </w:trPr>
+        <w:tc>
+          <w:tcPr>
+            <w:tcBorders>
+              <w:top w:val="single" w:space="0" w:color="D3D3D3"/>
+              <w:bottom w:val="single" w:space="0" w:color="D3D3D3"/>
+              <w:start w:val="single" w:space="0" w:color="D3D3D3"/>
+              <w:end w:val="single" w:space="0" w:color="D3D3D3"/>
+            </w:tcBorders>
+          </w:tcPr>
+          <w:p>
+            <w:pPr>
+              <w:spacing w:before="0" w:after="60"/>
+              <w:keepNext/>
+              <w:jc w:val="start"/>
+            </w:pPr>
+            <w:r>
+              <w:rPr>
+                <w:rFonts w:ascii="Calibri" w:hAnsi="Calibri"/>
+                <w:sz w:val="20"/>
+              </w:rPr>
+              <w:t xml:space="default">Measured BMI</w:t>
+            </w:r>
+          </w:p>
+        </w:tc>
+        <w:tc>
+          <w:tcPr>
+            <w:tcBorders>
+              <w:top w:val="single" w:space="0" w:color="D3D3D3"/>
+              <w:bottom w:val="single" w:space="0" w:color="D3D3D3"/>
+              <w:start w:val="single" w:space="0" w:color="D3D3D3"/>
+              <w:end w:val="single" w:space="0" w:color="D3D3D3"/>
+            </w:tcBorders>
+          </w:tcPr>
+          <w:p>
+            <w:pPr>
+              <w:spacing w:before="0" w:after="60"/>
+              <w:keepNext/>
+              <w:jc w:val="end"/>
+            </w:pPr>
+            <w:r>
+              <w:rPr>
+                <w:rFonts w:ascii="Calibri" w:hAnsi="Calibri"/>
+                <w:sz w:val="20"/>
+              </w:rPr>
+              <w:t xml:space="default">4,238</w:t>
+            </w:r>
+          </w:p>
+        </w:tc>
+        <w:tc>
+          <w:tcPr>
+            <w:tcBorders>
+              <w:top w:val="single" w:space="0" w:color="D3D3D3"/>
+              <w:bottom w:val="single" w:space="0" w:color="D3D3D3"/>
+              <w:start w:val="single" w:space="0" w:color="D3D3D3"/>
+              <w:end w:val="single" w:space="0" w:color="D3D3D3"/>
+            </w:tcBorders>
+          </w:tcPr>
+          <w:p>
+            <w:pPr>
+              <w:spacing w:before="0" w:after="60"/>
+              <w:keepNext/>
+              <w:jc w:val="end"/>
+            </w:pPr>
+            <w:r>
+              <w:rPr>
+                <w:rFonts w:ascii="Calibri" w:hAnsi="Calibri"/>
+                <w:sz w:val="20"/>
+              </w:rPr>
+              <w:t xml:space="default">47</w:t>
+            </w:r>
+          </w:p>
+        </w:tc>
+      </w:tr>
+      <w:tr>
+        <w:trPr>
+          <w:cantSplit/>
+        </w:trPr>
+        <w:tc>
+          <w:tcPr>
+            <w:tcBorders>
+              <w:top w:val="single" w:space="0" w:color="D3D3D3"/>
+              <w:bottom w:val="single" w:space="0" w:color="D3D3D3"/>
+              <w:start w:val="single" w:space="0" w:color="D3D3D3"/>
+              <w:end w:val="single" w:space="0" w:color="D3D3D3"/>
+            </w:tcBorders>
+          </w:tcPr>
+          <w:p>
+            <w:pPr>
+              <w:spacing w:before="0" w:after="60"/>
+              <w:keepNext/>
+              <w:jc w:val="start"/>
+            </w:pPr>
+            <w:r>
+              <w:rPr>
+                <w:rFonts w:ascii="Calibri" w:hAnsi="Calibri"/>
+                <w:sz w:val="20"/>
+              </w:rPr>
+              <w:t xml:space="default">Plausible energy intake</w:t>
+            </w:r>
+          </w:p>
+        </w:tc>
+        <w:tc>
+          <w:tcPr>
+            <w:tcBorders>
+              <w:top w:val="single" w:space="0" w:color="D3D3D3"/>
+              <w:bottom w:val="single" w:space="0" w:color="D3D3D3"/>
+              <w:start w:val="single" w:space="0" w:color="D3D3D3"/>
+              <w:end w:val="single" w:space="0" w:color="D3D3D3"/>
+            </w:tcBorders>
+          </w:tcPr>
+          <w:p>
+            <w:pPr>
+              <w:spacing w:before="0" w:after="60"/>
+              <w:keepNext/>
+              <w:jc w:val="end"/>
+            </w:pPr>
+            <w:r>
+              <w:rPr>
+                <w:rFonts w:ascii="Calibri" w:hAnsi="Calibri"/>
+                <w:sz w:val="20"/>
+              </w:rPr>
+              <w:t xml:space="default">4,214</w:t>
+            </w:r>
+          </w:p>
+        </w:tc>
+        <w:tc>
+          <w:tcPr>
+            <w:tcBorders>
+              <w:top w:val="single" w:space="0" w:color="D3D3D3"/>
+              <w:bottom w:val="single" w:space="0" w:color="D3D3D3"/>
+              <w:start w:val="single" w:space="0" w:color="D3D3D3"/>
+              <w:end w:val="single" w:space="0" w:color="D3D3D3"/>
+            </w:tcBorders>
+          </w:tcPr>
+          <w:p>
+            <w:pPr>
+              <w:spacing w:before="0" w:after="60"/>
+              <w:keepNext/>
+              <w:jc w:val="end"/>
+            </w:pPr>
+            <w:r>
+              <w:rPr>
+                <w:rFonts w:ascii="Calibri" w:hAnsi="Calibri"/>
+                <w:sz w:val="20"/>
+              </w:rPr>
+              <w:t xml:space="default">24</w:t>
+            </w:r>
+          </w:p>
+        </w:tc>
+      </w:tr>
+      <w:tr>
+        <w:trPr>
+          <w:cantSplit/>
+        </w:trPr>
+        <w:tc>
+          <w:tcPr>
+            <w:tcBorders>
+              <w:top w:val="single" w:space="0" w:color="D3D3D3"/>
+              <w:bottom w:val="single" w:space="0" w:color="D3D3D3"/>
+              <w:start w:val="single" w:space="0" w:color="D3D3D3"/>
+              <w:end w:val="single" w:space="0" w:color="D3D3D3"/>
+            </w:tcBorders>
+          </w:tcPr>
+          <w:p>
+            <w:pPr>
+              <w:spacing w:before="0" w:after="60"/>
+              <w:keepNext/>
+              <w:jc w:val="start"/>
+            </w:pPr>
+            <w:r>
+              <w:rPr>
+                <w:rFonts w:ascii="Calibri" w:hAnsi="Calibri"/>
+                <w:sz w:val="20"/>
+              </w:rPr>
+              <w:t xml:space="default">Not pregnant or breastfeeding</w:t>
+            </w:r>
+          </w:p>
+        </w:tc>
+        <w:tc>
+          <w:tcPr>
+            <w:tcBorders>
+              <w:top w:val="single" w:space="0" w:color="D3D3D3"/>
+              <w:bottom w:val="single" w:space="0" w:color="D3D3D3"/>
+              <w:start w:val="single" w:space="0" w:color="D3D3D3"/>
+              <w:end w:val="single" w:space="0" w:color="D3D3D3"/>
+            </w:tcBorders>
+          </w:tcPr>
+          <w:p>
+            <w:pPr>
+              <w:spacing w:before="0" w:after="60"/>
+              <w:keepNext/>
+              <w:jc w:val="end"/>
+            </w:pPr>
+            <w:r>
+              <w:rPr>
+                <w:rFonts w:ascii="Calibri" w:hAnsi="Calibri"/>
+                <w:sz w:val="20"/>
+              </w:rPr>
+              <w:t xml:space="default">4,178</w:t>
+            </w:r>
+          </w:p>
+        </w:tc>
+        <w:tc>
+          <w:tcPr>
+            <w:tcBorders>
+              <w:top w:val="single" w:space="0" w:color="D3D3D3"/>
+              <w:bottom w:val="single" w:space="0" w:color="D3D3D3"/>
+              <w:start w:val="single" w:space="0" w:color="D3D3D3"/>
+              <w:end w:val="single" w:space="0" w:color="D3D3D3"/>
+            </w:tcBorders>
+          </w:tcPr>
+          <w:p>
+            <w:pPr>
+              <w:spacing w:before="0" w:after="60"/>
+              <w:keepNext/>
+              <w:jc w:val="end"/>
+            </w:pPr>
+            <w:r>
+              <w:rPr>
+                <w:rFonts w:ascii="Calibri" w:hAnsi="Calibri"/>
+                <w:sz w:val="20"/>
+              </w:rPr>
+              <w:t xml:space="default">36</w:t>
+            </w:r>
+          </w:p>
+        </w:tc>
+      </w:tr>
+      <w:tr>
+        <w:trPr>
+          <w:cantSplit/>
+        </w:trPr>
+        <w:tc>
+          <w:tcPr>
+            <w:tcBorders>
+              <w:top w:val="single" w:space="0" w:color="D3D3D3"/>
+              <w:bottom w:val="single" w:space="0" w:color="D3D3D3"/>
+              <w:start w:val="single" w:space="0" w:color="D3D3D3"/>
+              <w:end w:val="single" w:space="0" w:color="D3D3D3"/>
+            </w:tcBorders>
+          </w:tcPr>
+          <w:p>
+            <w:pPr>
+              <w:spacing w:before="0" w:after="60"/>
+              <w:keepNext/>
+              <w:jc w:val="start"/>
+            </w:pPr>
+            <w:r>
+              <w:rPr>
+                <w:rFonts w:ascii="Calibri" w:hAnsi="Calibri"/>
+                <w:sz w:val="20"/>
+              </w:rPr>
+              <w:t xml:space="default">Not underweight (Aim 1 sample)</w:t>
+            </w:r>
+          </w:p>
+        </w:tc>
+        <w:tc>
+          <w:tcPr>
+            <w:tcBorders>
+              <w:top w:val="single" w:space="0" w:color="D3D3D3"/>
+              <w:bottom w:val="single" w:space="0" w:color="D3D3D3"/>
+              <w:start w:val="single" w:space="0" w:color="D3D3D3"/>
+              <w:end w:val="single" w:space="0" w:color="D3D3D3"/>
+            </w:tcBorders>
+          </w:tcPr>
+          <w:p>
+            <w:pPr>
+              <w:spacing w:before="0" w:after="60"/>
+              <w:keepNext/>
+              <w:jc w:val="end"/>
+            </w:pPr>
+            <w:r>
+              <w:rPr>
+                <w:rFonts w:ascii="Calibri" w:hAnsi="Calibri"/>
+                <w:sz w:val="20"/>
+              </w:rPr>
+              <w:t xml:space="default">4,124</w:t>
+            </w:r>
+          </w:p>
+        </w:tc>
+        <w:tc>
+          <w:tcPr>
+            <w:tcBorders>
+              <w:top w:val="single" w:space="0" w:color="D3D3D3"/>
+              <w:bottom w:val="single" w:space="0" w:color="D3D3D3"/>
+              <w:start w:val="single" w:space="0" w:color="D3D3D3"/>
+              <w:end w:val="single" w:space="0" w:color="D3D3D3"/>
+            </w:tcBorders>
+          </w:tcPr>
+          <w:p>
+            <w:pPr>
+              <w:spacing w:before="0" w:after="60"/>
+              <w:keepNext/>
+              <w:jc w:val="end"/>
+            </w:pPr>
+            <w:r>
+              <w:rPr>
+                <w:rFonts w:ascii="Calibri" w:hAnsi="Calibri"/>
+                <w:sz w:val="20"/>
+              </w:rPr>
+              <w:t xml:space="default">54</w:t>
+            </w:r>
+          </w:p>
+        </w:tc>
+      </w:tr>
+      <w:tr>
+        <w:trPr>
+          <w:cantSplit/>
+        </w:trPr>
+        <w:tc>
+          <w:tcPr>
+            <w:tcBorders>
+              <w:top w:val="single" w:space="0" w:color="D3D3D3"/>
+              <w:bottom w:val="single" w:space="0" w:color="D3D3D3"/>
+              <w:start w:val="single" w:space="0" w:color="D3D3D3"/>
+              <w:end w:val="single" w:space="0" w:color="D3D3D3"/>
+            </w:tcBorders>
+          </w:tcPr>
+          <w:p>
+            <w:pPr>
+              <w:spacing w:before="0" w:after="60"/>
+              <w:keepNext/>
+              <w:jc w:val="start"/>
+            </w:pPr>
+            <w:r>
+              <w:rPr>
+                <w:rFonts w:ascii="Calibri" w:hAnsi="Calibri"/>
+                <w:sz w:val="20"/>
+              </w:rPr>
+              <w:t xml:space="default">ALT measured</w:t>
+            </w:r>
+          </w:p>
+        </w:tc>
+        <w:tc>
+          <w:tcPr>
+            <w:tcBorders>
+              <w:top w:val="single" w:space="0" w:color="D3D3D3"/>
+              <w:bottom w:val="single" w:space="0" w:color="D3D3D3"/>
+              <w:start w:val="single" w:space="0" w:color="D3D3D3"/>
+              <w:end w:val="single" w:space="0" w:color="D3D3D3"/>
+            </w:tcBorders>
+          </w:tcPr>
+          <w:p>
+            <w:pPr>
+              <w:spacing w:before="0" w:after="60"/>
+              <w:keepNext/>
+              <w:jc w:val="end"/>
+            </w:pPr>
+            <w:r>
+              <w:rPr>
+                <w:rFonts w:ascii="Calibri" w:hAnsi="Calibri"/>
+                <w:sz w:val="20"/>
+              </w:rPr>
+              <w:t xml:space="default">3,753</w:t>
+            </w:r>
+          </w:p>
+        </w:tc>
+        <w:tc>
+          <w:tcPr>
+            <w:tcBorders>
+              <w:top w:val="single" w:space="0" w:color="D3D3D3"/>
+              <w:bottom w:val="single" w:space="0" w:color="D3D3D3"/>
+              <w:start w:val="single" w:space="0" w:color="D3D3D3"/>
+              <w:end w:val="single" w:space="0" w:color="D3D3D3"/>
+            </w:tcBorders>
+          </w:tcPr>
+          <w:p>
+            <w:pPr>
+              <w:spacing w:before="0" w:after="60"/>
+              <w:keepNext/>
+              <w:jc w:val="end"/>
+            </w:pPr>
+            <w:r>
+              <w:rPr>
+                <w:rFonts w:ascii="Calibri" w:hAnsi="Calibri"/>
+                <w:sz w:val="20"/>
+              </w:rPr>
+              <w:t xml:space="default">371</w:t>
+            </w:r>
+          </w:p>
+        </w:tc>
+      </w:tr>
+      <w:tr>
+        <w:trPr>
+          <w:cantSplit/>
+        </w:trPr>
+        <w:tc>
+          <w:tcPr>
+            <w:tcBorders>
+              <w:top w:val="single" w:space="0" w:color="D3D3D3"/>
+              <w:bottom w:val="single" w:space="0" w:color="D3D3D3"/>
+              <w:start w:val="single" w:space="0" w:color="D3D3D3"/>
+              <w:end w:val="single" w:space="0" w:color="D3D3D3"/>
+            </w:tcBorders>
+          </w:tcPr>
+          <w:p>
+            <w:pPr>
+              <w:spacing w:before="0" w:after="60"/>
+              <w:keepNext/>
+              <w:jc w:val="start"/>
+            </w:pPr>
+            <w:r>
+              <w:rPr>
+                <w:rFonts w:ascii="Calibri" w:hAnsi="Calibri"/>
+                <w:sz w:val="20"/>
+              </w:rPr>
+              <w:t xml:space="default">No liver disease</w:t>
+            </w:r>
+          </w:p>
+        </w:tc>
+        <w:tc>
+          <w:tcPr>
+            <w:tcBorders>
+              <w:top w:val="single" w:space="0" w:color="D3D3D3"/>
+              <w:bottom w:val="single" w:space="0" w:color="D3D3D3"/>
+              <w:start w:val="single" w:space="0" w:color="D3D3D3"/>
+              <w:end w:val="single" w:space="0" w:color="D3D3D3"/>
+            </w:tcBorders>
+          </w:tcPr>
+          <w:p>
+            <w:pPr>
+              <w:spacing w:before="0" w:after="60"/>
+              <w:keepNext/>
+              <w:jc w:val="end"/>
+            </w:pPr>
+            <w:r>
+              <w:rPr>
+                <w:rFonts w:ascii="Calibri" w:hAnsi="Calibri"/>
+                <w:sz w:val="20"/>
+              </w:rPr>
+              <w:t xml:space="default">3,525</w:t>
+            </w:r>
+          </w:p>
+        </w:tc>
+        <w:tc>
+          <w:tcPr>
+            <w:tcBorders>
+              <w:top w:val="single" w:space="0" w:color="D3D3D3"/>
+              <w:bottom w:val="single" w:space="0" w:color="D3D3D3"/>
+              <w:start w:val="single" w:space="0" w:color="D3D3D3"/>
+              <w:end w:val="single" w:space="0" w:color="D3D3D3"/>
+            </w:tcBorders>
+          </w:tcPr>
+          <w:p>
+            <w:pPr>
+              <w:spacing w:before="0" w:after="60"/>
+              <w:keepNext/>
+              <w:jc w:val="end"/>
+            </w:pPr>
+            <w:r>
+              <w:rPr>
+                <w:rFonts w:ascii="Calibri" w:hAnsi="Calibri"/>
+                <w:sz w:val="20"/>
+              </w:rPr>
+              <w:t xml:space="default">228</w:t>
+            </w:r>
+          </w:p>
+        </w:tc>
+      </w:tr>
+      <w:tr>
+        <w:trPr>
+          <w:cantSplit/>
+        </w:trPr>
+        <w:tc>
+          <w:tcPr>
+            <w:tcBorders>
+              <w:top w:val="single" w:space="0" w:color="D3D3D3"/>
+              <w:bottom w:val="single" w:space="0" w:color="D3D3D3"/>
+              <w:start w:val="single" w:space="0" w:color="D3D3D3"/>
+              <w:end w:val="single" w:space="0" w:color="D3D3D3"/>
+            </w:tcBorders>
+          </w:tcPr>
+          <w:p>
+            <w:pPr>
+              <w:spacing w:before="0" w:after="60"/>
+              <w:keepNext/>
+              <w:jc w:val="start"/>
+            </w:pPr>
+            <w:r>
+              <w:rPr>
+                <w:rFonts w:ascii="Calibri" w:hAnsi="Calibri"/>
+                <w:sz w:val="20"/>
+              </w:rPr>
+              <w:t xml:space="default">No hepatitis B</w:t>
+            </w:r>
+          </w:p>
+        </w:tc>
+        <w:tc>
+          <w:tcPr>
+            <w:tcBorders>
+              <w:top w:val="single" w:space="0" w:color="D3D3D3"/>
+              <w:bottom w:val="single" w:space="0" w:color="D3D3D3"/>
+              <w:start w:val="single" w:space="0" w:color="D3D3D3"/>
+              <w:end w:val="single" w:space="0" w:color="D3D3D3"/>
+            </w:tcBorders>
+          </w:tcPr>
+          <w:p>
+            <w:pPr>
+              <w:spacing w:before="0" w:after="60"/>
+              <w:keepNext/>
+              <w:jc w:val="end"/>
+            </w:pPr>
+            <w:r>
+              <w:rPr>
+                <w:rFonts w:ascii="Calibri" w:hAnsi="Calibri"/>
+                <w:sz w:val="20"/>
+              </w:rPr>
+              <w:t xml:space="default">3,488</w:t>
+            </w:r>
+          </w:p>
+        </w:tc>
+        <w:tc>
+          <w:tcPr>
+            <w:tcBorders>
+              <w:top w:val="single" w:space="0" w:color="D3D3D3"/>
+              <w:bottom w:val="single" w:space="0" w:color="D3D3D3"/>
+              <w:start w:val="single" w:space="0" w:color="D3D3D3"/>
+              <w:end w:val="single" w:space="0" w:color="D3D3D3"/>
+            </w:tcBorders>
+          </w:tcPr>
+          <w:p>
+            <w:pPr>
+              <w:spacing w:before="0" w:after="60"/>
+              <w:keepNext/>
+              <w:jc w:val="end"/>
+            </w:pPr>
+            <w:r>
+              <w:rPr>
+                <w:rFonts w:ascii="Calibri" w:hAnsi="Calibri"/>
+                <w:sz w:val="20"/>
+              </w:rPr>
+              <w:t xml:space="default">37</w:t>
+            </w:r>
+          </w:p>
+        </w:tc>
+      </w:tr>
+      <w:tr>
+        <w:trPr>
+          <w:cantSplit/>
+        </w:trPr>
+        <w:tc>
+          <w:tcPr>
+            <w:tcBorders>
+              <w:top w:val="single" w:space="0" w:color="D3D3D3"/>
+              <w:bottom w:val="single" w:space="0" w:color="D3D3D3"/>
+              <w:start w:val="single" w:space="0" w:color="D3D3D3"/>
+              <w:end w:val="single" w:space="0" w:color="D3D3D3"/>
+            </w:tcBorders>
+          </w:tcPr>
+          <w:p>
+            <w:pPr>
+              <w:spacing w:before="0" w:after="60"/>
+              <w:keepNext/>
+              <w:jc w:val="start"/>
+            </w:pPr>
+            <w:r>
+              <w:rPr>
+                <w:rFonts w:ascii="Calibri" w:hAnsi="Calibri"/>
+                <w:sz w:val="20"/>
+              </w:rPr>
+              <w:t xml:space="default">No heavy alcohol consumption (Aim 2 sample)</w:t>
+            </w:r>
+          </w:p>
+        </w:tc>
+        <w:tc>
+          <w:tcPr>
+            <w:tcBorders>
+              <w:top w:val="single" w:space="0" w:color="D3D3D3"/>
+              <w:bottom w:val="single" w:space="0" w:color="D3D3D3"/>
+              <w:start w:val="single" w:space="0" w:color="D3D3D3"/>
+              <w:end w:val="single" w:space="0" w:color="D3D3D3"/>
+            </w:tcBorders>
+          </w:tcPr>
+          <w:p>
+            <w:pPr>
+              <w:spacing w:before="0" w:after="60"/>
+              <w:keepNext/>
+              <w:jc w:val="end"/>
+            </w:pPr>
+            <w:r>
+              <w:rPr>
+                <w:rFonts w:ascii="Calibri" w:hAnsi="Calibri"/>
+                <w:sz w:val="20"/>
+              </w:rPr>
+              <w:t xml:space="default">2,308</w:t>
+            </w:r>
+          </w:p>
+        </w:tc>
+        <w:tc>
+          <w:tcPr>
+            <w:tcBorders>
+              <w:top w:val="single" w:space="0" w:color="D3D3D3"/>
+              <w:bottom w:val="single" w:space="0" w:color="D3D3D3"/>
+              <w:start w:val="single" w:space="0" w:color="D3D3D3"/>
+              <w:end w:val="single" w:space="0" w:color="D3D3D3"/>
+            </w:tcBorders>
+          </w:tcPr>
+          <w:p>
+            <w:pPr>
+              <w:spacing w:before="0" w:after="60"/>
+              <w:keepNext/>
+              <w:jc w:val="end"/>
+            </w:pPr>
+            <w:r>
+              <w:rPr>
+                <w:rFonts w:ascii="Calibri" w:hAnsi="Calibri"/>
+                <w:sz w:val="20"/>
+              </w:rPr>
+              <w:t xml:space="default">1,180</w:t>
+            </w:r>
+          </w:p>
+        </w:tc>
+      </w:tr>
+      <w:tr>
+        <w:trPr>
+          <w:cantSplit/>
+        </w:trPr>
+        <w:tc>
+          <w:tcPr>
+            <w:tcBorders>
+              <w:top w:val="single" w:space="0" w:color="D3D3D3"/>
+              <w:bottom w:val="single" w:space="0" w:color="D3D3D3"/>
+              <w:start w:val="single" w:space="0" w:color="D3D3D3"/>
+              <w:end w:val="single" w:space="0" w:color="D3D3D3"/>
+            </w:tcBorders>
+          </w:tcPr>
+          <w:p>
+            <w:pPr>
+              <w:spacing w:before="0" w:after="60"/>
+              <w:keepNext/>
+              <w:jc w:val="start"/>
+            </w:pPr>
+            <w:r>
+              <w:rPr>
+                <w:rFonts w:ascii="Calibri" w:hAnsi="Calibri"/>
+                <w:sz w:val="20"/>
+              </w:rPr>
+              <w:t xml:space="default">Complete covariate data (adjusted models)</w:t>
+            </w:r>
+          </w:p>
+        </w:tc>
+        <w:tc>
+          <w:tcPr>
+            <w:tcBorders>
+              <w:top w:val="single" w:space="0" w:color="D3D3D3"/>
+              <w:bottom w:val="single" w:space="0" w:color="D3D3D3"/>
+              <w:start w:val="single" w:space="0" w:color="D3D3D3"/>
+              <w:end w:val="single" w:space="0" w:color="D3D3D3"/>
+            </w:tcBorders>
+          </w:tcPr>
+          <w:p>
+            <w:pPr>
+              <w:spacing w:before="0" w:after="60"/>
+              <w:keepNext/>
+              <w:jc w:val="end"/>
+            </w:pPr>
+            <w:r>
+              <w:rPr>
+                <w:rFonts w:ascii="Calibri" w:hAnsi="Calibri"/>
+                <w:sz w:val="20"/>
+              </w:rPr>
+              <w:t xml:space="default">2,043</w:t>
+            </w:r>
+          </w:p>
+        </w:tc>
+        <w:tc>
+          <w:tcPr>
+            <w:tcBorders>
+              <w:top w:val="single" w:space="0" w:color="D3D3D3"/>
+              <w:bottom w:val="single" w:space="0" w:color="D3D3D3"/>
+              <w:start w:val="single" w:space="0" w:color="D3D3D3"/>
+              <w:end w:val="single" w:space="0" w:color="D3D3D3"/>
+            </w:tcBorders>
+          </w:tcPr>
+          <w:p>
+            <w:pPr>
+              <w:spacing w:before="0" w:after="60"/>
+              <w:keepNext/>
+              <w:jc w:val="end"/>
+            </w:pPr>
+            <w:r>
+              <w:rPr>
+                <w:rFonts w:ascii="Calibri" w:hAnsi="Calibri"/>
+                <w:sz w:val="20"/>
+              </w:rPr>
+              <w:t xml:space="default">265</w:t>
+            </w:r>
+          </w:p>
+        </w:tc>
+      </w:tr>
+      <w:tr>
+        <w:trPr>
+          <w:cantSplit/>
+        </w:trPr>
+        <w:tc>
+          <w:tcPr>
+            <w:gridSpan w:val="3"/>
+          </w:tcPr>
+          <w:p>
+            <w:pPr>
+              <w:spacing w:before="0" w:after="60"/>
+              <w:keepNext/>
+            </w:pPr>
+            <w:r>
+              <w:rPr>
+                <w:rFonts w:ascii="Calibri" w:hAnsi="Calibri"/>
+                <w:sz w:val="20"/>
+              </w:rPr>
+              <w:t xml:space="default">NHANES August 2021 to August 2023.</w:t>
+            </w:r>
+          </w:p>
+        </w:tc>
+      </w:tr>
+    </w:tbl>
+    <w:tbl>
+      <w:tblPr>
+        <w:tblStyle w:val="Table"/>
+        <w:tblW w:type="pct" w:w="5000"/>
+        <w:tblLayout w:type="fixed"/>
+        <w:tblLook w:firstRow="0" w:lastRow="0" w:firstColumn="0" w:lastColumn="0" w:noHBand="0" w:noVBand="0" w:val="0000"/>
+      </w:tblPr>
+      <w:tblGrid>
+        <w:gridCol w:w="7920"/>
+      </w:tblGrid>
+      <w:tr>
+        <w:tc>
+          <w:tcPr/>
+          <w:bookmarkStart w:id="19" w:name="fig-flowchart"/>
+          <w:p>
+            <w:pPr>
+              <w:jc w:val="center"/>
+            </w:pPr>
+            <w:r>
+              <w:drawing>
+                <wp:inline>
+                  <wp:extent cx="5334000" cy="5628592"/>
+                  <wp:effectExtent b="0" l="0" r="0" t="0"/>
+                  <wp:docPr descr="" title="" id="17" name="Picture"/>
+                  <a:graphic>
+                    <a:graphicData uri="http://schemas.openxmlformats.org/drawingml/2006/picture">
+                      <pic:pic>
+                        <pic:nvPicPr>
+                          <pic:cNvPr descr="Tables-Figures_files/figure-docx/mermaid-figure-1.png" id="18" name="Picture"/>
+                          <pic:cNvPicPr>
+                            <a:picLocks noChangeArrowheads="1" noChangeAspect="1"/>
+                          </pic:cNvPicPr>
+                        </pic:nvPicPr>
+                        <pic:blipFill>
+                          <a:blip r:embed="rId16"/>
+                          <a:stretch>
+                            <a:fillRect/>
+                          </a:stretch>
+                        </pic:blipFill>
+                        <pic:spPr bwMode="auto">
+                          <a:xfrm>
+                            <a:off x="0" y="0"/>
+                            <a:ext cx="5334000" cy="5628592"/>
+                          </a:xfrm>
+                          <a:prstGeom prst="rect">
+                            <a:avLst/>
+                          </a:prstGeom>
+                          <a:noFill/>
+                          <a:ln w="9525">
+                            <a:noFill/>
+                            <a:headEnd/>
+                            <a:tailEnd/>
+                          </a:ln>
+                        </pic:spPr>
+                      </pic:pic>
+                    </a:graphicData>
+                  </a:graphic>
+                </wp:inline>
+              </w:drawing>
+            </w:r>
+          </w:p>
+          <w:p>
+            <w:pPr>
+              <w:jc w:val="center"/>
+            </w:pPr>
+            <w:pPr>
+              <w:jc w:val="left"/>
+              <w:spacing w:before="200"/>
+              <w:pStyle w:val="ImageCaption"/>
+            </w:pPr>
+            <w:r>
+              <w:t xml:space="preserve">Figure 1: Participant flow, NHANES August 2021 to August 2023.</w:t>
+            </w:r>
+          </w:p>
+          <w:bookmarkEnd w:id="19"/>
+        </w:tc>
+      </w:tr>
+    </w:tbl>
+    <w:p>
+      <w:r>
+        <w:br w:type="page"/>
+      </w:r>
+    </w:p>
+    <w:bookmarkEnd w:id="20"/>
+    <w:bookmarkStart w:id="24" w:name="figure-2"/>
+    <w:p>
+      <w:pPr>
+        <w:pStyle w:val="Heading1"/>
+      </w:pPr>
+      <w:r>
+        <w:rPr>
+          <w:b/>
+          <w:bCs/>
+        </w:rPr>
+        <w:t xml:space="preserve">Figure 2</w:t>
       </w:r>
     </w:p>
     <w:p>
@@ -11646,18 +12818,18 @@
           <wp:inline>
             <wp:extent cx="5334000" cy="3000374"/>
             <wp:effectExtent b="0" l="0" r="0" t="0"/>
-            <wp:docPr descr="" title="" id="17" name="Picture"/>
+            <wp:docPr descr="" title="" id="22" name="Picture"/>
             <a:graphic>
               <a:graphicData uri="http://schemas.openxmlformats.org/drawingml/2006/picture">
                 <pic:pic>
                   <pic:nvPicPr>
-                    <pic:cNvPr descr="figure1_sex_bmi.png" id="18" name="Picture"/>
+                    <pic:cNvPr descr="figure2_sex_bmi.png" id="23" name="Picture"/>
                     <pic:cNvPicPr>
                       <a:picLocks noChangeArrowheads="1" noChangeAspect="1"/>
                     </pic:cNvPicPr>
                   </pic:nvPicPr>
                   <pic:blipFill>
-                    <a:blip r:embed="rId16"/>
+                    <a:blip r:embed="rId21"/>
                     <a:stretch>
                       <a:fillRect/>
                     </a:stretch>
@@ -11689,8 +12861,8 @@
         <w:br w:type="page"/>
       </w:r>
     </w:p>
-    <w:bookmarkEnd w:id="19"/>
-    <w:bookmarkStart w:id="23" w:name="figure-2"/>
+    <w:bookmarkEnd w:id="24"/>
+    <w:bookmarkStart w:id="28" w:name="figure-3"/>
     <w:p>
       <w:pPr>
         <w:pStyle w:val="Heading1"/>
@@ -11700,7 +12872,7 @@
           <w:b/>
           <w:bCs/>
         </w:rPr>
-        <w:t xml:space="preserve">Figure 2</w:t>
+        <w:t xml:space="preserve">Figure 3</w:t>
       </w:r>
     </w:p>
     <w:p>
@@ -11712,18 +12884,18 @@
           <wp:inline>
             <wp:extent cx="5334000" cy="3000374"/>
             <wp:effectExtent b="0" l="0" r="0" t="0"/>
-            <wp:docPr descr="" title="" id="21" name="Picture"/>
+            <wp:docPr descr="" title="" id="26" name="Picture"/>
             <a:graphic>
               <a:graphicData uri="http://schemas.openxmlformats.org/drawingml/2006/picture">
                 <pic:pic>
                   <pic:nvPicPr>
-                    <pic:cNvPr descr="figure2_menopause.png" id="22" name="Picture"/>
+                    <pic:cNvPr descr="figure3_menopause.png" id="27" name="Picture"/>
                     <pic:cNvPicPr>
                       <a:picLocks noChangeArrowheads="1" noChangeAspect="1"/>
                     </pic:cNvPicPr>
                   </pic:nvPicPr>
                   <pic:blipFill>
-                    <a:blip r:embed="rId20"/>
+                    <a:blip r:embed="rId25"/>
                     <a:stretch>
                       <a:fillRect/>
                     </a:stretch>
@@ -11755,8 +12927,8 @@
         <w:br w:type="page"/>
       </w:r>
     </w:p>
-    <w:bookmarkEnd w:id="23"/>
-    <w:bookmarkStart w:id="27" w:name="figure-3"/>
+    <w:bookmarkEnd w:id="28"/>
+    <w:bookmarkStart w:id="32" w:name="figure-4"/>
     <w:p>
       <w:pPr>
         <w:pStyle w:val="Heading1"/>
@@ -11766,7 +12938,7 @@
           <w:b/>
           <w:bCs/>
         </w:rPr>
-        <w:t xml:space="preserve">Figure 3</w:t>
+        <w:t xml:space="preserve">Figure 4</w:t>
       </w:r>
     </w:p>
     <w:p>
@@ -11778,18 +12950,18 @@
           <wp:inline>
             <wp:extent cx="5334000" cy="3000374"/>
             <wp:effectExtent b="0" l="0" r="0" t="0"/>
-            <wp:docPr descr="" title="" id="25" name="Picture"/>
+            <wp:docPr descr="" title="" id="30" name="Picture"/>
             <a:graphic>
               <a:graphicData uri="http://schemas.openxmlformats.org/drawingml/2006/picture">
                 <pic:pic>
                   <pic:nvPicPr>
-                    <pic:cNvPr descr="figure3_groups.png" id="26" name="Picture"/>
+                    <pic:cNvPr descr="figure4_groups.png" id="31" name="Picture"/>
                     <pic:cNvPicPr>
                       <a:picLocks noChangeArrowheads="1" noChangeAspect="1"/>
                     </pic:cNvPicPr>
                   </pic:nvPicPr>
                   <pic:blipFill>
-                    <a:blip r:embed="rId24"/>
+                    <a:blip r:embed="rId29"/>
                     <a:stretch>
                       <a:fillRect/>
                     </a:stretch>
@@ -11816,7 +12988,7 @@
         </w:drawing>
       </w:r>
     </w:p>
-    <w:bookmarkEnd w:id="27"/>
+    <w:bookmarkEnd w:id="32"/>
     <w:sectPr>
       <w:footnotePr>
         <w:numRestart w:val="eachSect"/>

</xml_diff>

<commit_message>
updating table 7 and models based on feedback
</commit_message>
<xml_diff>
--- a/output/Tables-Figures.docx
+++ b/output/Tables-Figures.docx
@@ -11545,13 +11545,26 @@
         </w:trPr>
         <w:tc>
           <w:tcPr>
-            <w:gridSpan w:val="10"/>
-          </w:tcPr>
-          <w:p>
-            <w:pPr>
-              <w:spacing w:before="0" w:after="60"/>
-              <w:keepNext/>
-            </w:pPr>
+            <w:tcBorders>
+              <w:top w:val="single" w:space="0" w:color="D3D3D3"/>
+              <w:bottom w:val="single" w:space="0" w:color="D3D3D3"/>
+              <w:start w:val="single" w:space="0" w:color="D3D3D3"/>
+              <w:end w:val="single" w:space="0" w:color="D3D3D3"/>
+            </w:tcBorders>
+          </w:tcPr>
+          <w:p>
+            <w:pPr>
+              <w:spacing w:before="0" w:after="60"/>
+              <w:keepNext/>
+              <w:jc w:val="start"/>
+            </w:pPr>
+            <w:r>
+              <w:rPr>
+                <w:rFonts w:ascii="Calibri" w:hAnsi="Calibri"/>
+                <w:sz w:val="20"/>
+              </w:rPr>
+              <w:t xml:space="default">P for interaction</w:t>
+            </w:r>
             <w:r>
               <w:rPr>
                 <w:vertAlign w:val="superscript"/>
@@ -11559,6 +11572,247 @@
                 <w:rFonts w:ascii="Calibri" w:hAnsi="Calibri"/>
                 <w:sz w:val="20"/>
               </w:rPr>
+              <w:t xml:space="default">2</w:t>
+            </w:r>
+          </w:p>
+        </w:tc>
+        <w:tc>
+          <w:tcPr>
+            <w:tcBorders>
+              <w:top w:val="single" w:space="0" w:color="D3D3D3"/>
+              <w:bottom w:val="single" w:space="0" w:color="D3D3D3"/>
+              <w:start w:val="single" w:space="0" w:color="D3D3D3"/>
+              <w:end w:val="single" w:space="0" w:color="D3D3D3"/>
+            </w:tcBorders>
+          </w:tcPr>
+          <w:p>
+            <w:pPr>
+              <w:spacing w:before="0" w:after="60"/>
+              <w:keepNext/>
+              <w:jc w:val="end"/>
+            </w:pPr>
+            <w:r>
+              <w:rPr>
+                <w:rFonts w:ascii="Calibri" w:hAnsi="Calibri"/>
+                <w:sz w:val="20"/>
+              </w:rPr>
+              <w:t xml:space="default"/>
+            </w:r>
+          </w:p>
+        </w:tc>
+        <w:tc>
+          <w:tcPr>
+            <w:tcBorders>
+              <w:top w:val="single" w:space="0" w:color="D3D3D3"/>
+              <w:bottom w:val="single" w:space="0" w:color="D3D3D3"/>
+              <w:start w:val="single" w:space="0" w:color="D3D3D3"/>
+              <w:end w:val="single" w:space="0" w:color="D3D3D3"/>
+            </w:tcBorders>
+          </w:tcPr>
+          <w:p>
+            <w:pPr>
+              <w:spacing w:before="0" w:after="60"/>
+              <w:keepNext/>
+              <w:jc w:val="end"/>
+            </w:pPr>
+            <w:r>
+              <w:rPr>
+                <w:rFonts w:ascii="Calibri" w:hAnsi="Calibri"/>
+                <w:sz w:val="20"/>
+              </w:rPr>
+              <w:t xml:space="default"/>
+            </w:r>
+          </w:p>
+        </w:tc>
+        <w:tc>
+          <w:tcPr>
+            <w:tcBorders>
+              <w:top w:val="single" w:space="0" w:color="D3D3D3"/>
+              <w:bottom w:val="single" w:space="0" w:color="D3D3D3"/>
+              <w:start w:val="single" w:space="0" w:color="D3D3D3"/>
+              <w:end w:val="single" w:space="0" w:color="D3D3D3"/>
+            </w:tcBorders>
+          </w:tcPr>
+          <w:p>
+            <w:pPr>
+              <w:spacing w:before="0" w:after="60"/>
+              <w:keepNext/>
+              <w:jc w:val="center"/>
+            </w:pPr>
+            <w:r>
+              <w:rPr>
+                <w:rFonts w:ascii="Calibri" w:hAnsi="Calibri"/>
+                <w:sz w:val="20"/>
+              </w:rPr>
+              <w:t xml:space="default">0.21</w:t>
+            </w:r>
+          </w:p>
+        </w:tc>
+        <w:tc>
+          <w:tcPr>
+            <w:tcBorders>
+              <w:top w:val="single" w:space="0" w:color="D3D3D3"/>
+              <w:bottom w:val="single" w:space="0" w:color="D3D3D3"/>
+              <w:start w:val="single" w:space="0" w:color="D3D3D3"/>
+              <w:end w:val="single" w:space="0" w:color="D3D3D3"/>
+            </w:tcBorders>
+          </w:tcPr>
+          <w:p>
+            <w:pPr>
+              <w:spacing w:before="0" w:after="60"/>
+              <w:keepNext/>
+              <w:jc w:val="end"/>
+            </w:pPr>
+            <w:r>
+              <w:rPr>
+                <w:rFonts w:ascii="Calibri" w:hAnsi="Calibri"/>
+                <w:sz w:val="20"/>
+              </w:rPr>
+              <w:t xml:space="default"/>
+            </w:r>
+          </w:p>
+        </w:tc>
+        <w:tc>
+          <w:tcPr>
+            <w:tcBorders>
+              <w:top w:val="single" w:space="0" w:color="D3D3D3"/>
+              <w:bottom w:val="single" w:space="0" w:color="D3D3D3"/>
+              <w:start w:val="single" w:space="0" w:color="D3D3D3"/>
+              <w:end w:val="single" w:space="0" w:color="D3D3D3"/>
+            </w:tcBorders>
+          </w:tcPr>
+          <w:p>
+            <w:pPr>
+              <w:spacing w:before="0" w:after="60"/>
+              <w:keepNext/>
+              <w:jc w:val="end"/>
+            </w:pPr>
+            <w:r>
+              <w:rPr>
+                <w:rFonts w:ascii="Calibri" w:hAnsi="Calibri"/>
+                <w:sz w:val="20"/>
+              </w:rPr>
+              <w:t xml:space="default"/>
+            </w:r>
+          </w:p>
+        </w:tc>
+        <w:tc>
+          <w:tcPr>
+            <w:tcBorders>
+              <w:top w:val="single" w:space="0" w:color="D3D3D3"/>
+              <w:bottom w:val="single" w:space="0" w:color="D3D3D3"/>
+              <w:start w:val="single" w:space="0" w:color="D3D3D3"/>
+              <w:end w:val="single" w:space="0" w:color="D3D3D3"/>
+            </w:tcBorders>
+          </w:tcPr>
+          <w:p>
+            <w:pPr>
+              <w:spacing w:before="0" w:after="60"/>
+              <w:keepNext/>
+              <w:jc w:val="center"/>
+            </w:pPr>
+            <w:r>
+              <w:rPr>
+                <w:rFonts w:ascii="Calibri" w:hAnsi="Calibri"/>
+                <w:sz w:val="20"/>
+              </w:rPr>
+              <w:t xml:space="default">0.50</w:t>
+            </w:r>
+          </w:p>
+        </w:tc>
+        <w:tc>
+          <w:tcPr>
+            <w:tcBorders>
+              <w:top w:val="single" w:space="0" w:color="D3D3D3"/>
+              <w:bottom w:val="single" w:space="0" w:color="D3D3D3"/>
+              <w:start w:val="single" w:space="0" w:color="D3D3D3"/>
+              <w:end w:val="single" w:space="0" w:color="D3D3D3"/>
+            </w:tcBorders>
+          </w:tcPr>
+          <w:p>
+            <w:pPr>
+              <w:spacing w:before="0" w:after="60"/>
+              <w:keepNext/>
+              <w:jc w:val="end"/>
+            </w:pPr>
+            <w:r>
+              <w:rPr>
+                <w:rFonts w:ascii="Calibri" w:hAnsi="Calibri"/>
+                <w:sz w:val="20"/>
+              </w:rPr>
+              <w:t xml:space="default"/>
+            </w:r>
+          </w:p>
+        </w:tc>
+        <w:tc>
+          <w:tcPr>
+            <w:tcBorders>
+              <w:top w:val="single" w:space="0" w:color="D3D3D3"/>
+              <w:bottom w:val="single" w:space="0" w:color="D3D3D3"/>
+              <w:start w:val="single" w:space="0" w:color="D3D3D3"/>
+              <w:end w:val="single" w:space="0" w:color="D3D3D3"/>
+            </w:tcBorders>
+          </w:tcPr>
+          <w:p>
+            <w:pPr>
+              <w:spacing w:before="0" w:after="60"/>
+              <w:keepNext/>
+              <w:jc w:val="end"/>
+            </w:pPr>
+            <w:r>
+              <w:rPr>
+                <w:rFonts w:ascii="Calibri" w:hAnsi="Calibri"/>
+                <w:sz w:val="20"/>
+              </w:rPr>
+              <w:t xml:space="default"/>
+            </w:r>
+          </w:p>
+        </w:tc>
+        <w:tc>
+          <w:tcPr>
+            <w:tcBorders>
+              <w:top w:val="single" w:space="0" w:color="D3D3D3"/>
+              <w:bottom w:val="single" w:space="0" w:color="D3D3D3"/>
+              <w:start w:val="single" w:space="0" w:color="D3D3D3"/>
+              <w:end w:val="single" w:space="0" w:color="D3D3D3"/>
+            </w:tcBorders>
+          </w:tcPr>
+          <w:p>
+            <w:pPr>
+              <w:spacing w:before="0" w:after="60"/>
+              <w:keepNext/>
+              <w:jc w:val="center"/>
+            </w:pPr>
+            <w:r>
+              <w:rPr>
+                <w:rFonts w:ascii="Calibri" w:hAnsi="Calibri"/>
+                <w:sz w:val="20"/>
+              </w:rPr>
+              <w:t xml:space="default">&gt;0.99</w:t>
+            </w:r>
+          </w:p>
+        </w:tc>
+      </w:tr>
+      <w:tr>
+        <w:trPr>
+          <w:cantSplit/>
+        </w:trPr>
+        <w:tc>
+          <w:tcPr>
+            <w:gridSpan w:val="10"/>
+          </w:tcPr>
+          <w:p>
+            <w:pPr>
+              <w:spacing w:before="0" w:after="60"/>
+              <w:keepNext/>
+            </w:pPr>
+            <w:r>
+              <w:rPr>
+                <w:vertAlign w:val="superscript"/>
+                <w:i/>
+                <w:rFonts w:ascii="Calibri" w:hAnsi="Calibri"/>
+                <w:sz w:val="20"/>
+              </w:rPr>
               <w:t xml:space="default">1</w:t>
             </w:r>
             <w:r>
@@ -11567,6 +11821,38 @@
                 <w:sz w:val="20"/>
               </w:rPr>
               <w:t xml:space="default">Ratio of geometric means for low vs. higher choline within the same BMI category, adjusted for age, sex, race and ethnicity, and income-to-poverty ratio.</w:t>
+            </w:r>
+          </w:p>
+        </w:tc>
+      </w:tr>
+      <w:tr>
+        <w:trPr>
+          <w:cantSplit/>
+        </w:trPr>
+        <w:tc>
+          <w:tcPr>
+            <w:gridSpan w:val="10"/>
+          </w:tcPr>
+          <w:p>
+            <w:pPr>
+              <w:spacing w:before="0" w:after="60"/>
+              <w:keepNext/>
+            </w:pPr>
+            <w:r>
+              <w:rPr>
+                <w:vertAlign w:val="superscript"/>
+                <w:i/>
+                <w:rFonts w:ascii="Calibri" w:hAnsi="Calibri"/>
+                <w:sz w:val="20"/>
+              </w:rPr>
+              <w:t xml:space="default">2</w:t>
+            </w:r>
+            <w:r>
+              <w:rPr>
+                <w:rFonts w:ascii="Calibri" w:hAnsi="Calibri"/>
+                <w:sz w:val="20"/>
+              </w:rPr>
+              <w:t xml:space="default">Choline × BMI interaction from survey-weighted linear regression.</w:t>
             </w:r>
           </w:p>
         </w:tc>

</xml_diff>

<commit_message>
updating table based on additional feedback
</commit_message>
<xml_diff>
--- a/output/Tables-Figures.docx
+++ b/output/Tables-Figures.docx
@@ -11820,7 +11820,7 @@
                 <w:rFonts w:ascii="Calibri" w:hAnsi="Calibri"/>
                 <w:sz w:val="20"/>
               </w:rPr>
-              <w:t xml:space="default">Ratio of geometric means for low vs. higher choline within the same BMI category, adjusted for age, sex, race and ethnicity, and income-to-poverty ratio.</w:t>
+              <w:t xml:space="default">Low vs. higher choline within each BMI category, estimated as contrasts from the six-group model in Table 6, adjusted for age, sex, race and ethnicity, and income-to-poverty ratio.</w:t>
             </w:r>
           </w:p>
         </w:tc>
@@ -11852,7 +11852,7 @@
                 <w:rFonts w:ascii="Calibri" w:hAnsi="Calibri"/>
                 <w:sz w:val="20"/>
               </w:rPr>
-              <w:t xml:space="default">Choline × BMI interaction from survey-weighted linear regression.</w:t>
+              <w:t xml:space="default">Single overall test of whether the choline association differs across BMI categories (choline × BMI interaction); no ratio is estimated.</w:t>
             </w:r>
           </w:p>
         </w:tc>

</xml_diff>